<commit_message>
feat: add internship duplication functionality, allowing admins to create independent copies of internships, and enhance certificate job processing for internships
</commit_message>
<xml_diff>
--- a/frontend/public/course-certificates/Certificates/Airkrit India Certificate Internship - AI-01171 - Template.docx
+++ b/frontend/public/course-certificates/Certificates/Airkrit India Certificate Internship - AI-01171 - Template.docx
@@ -198,10 +198,9 @@
               <w:rPr>
                 <w:noProof/>
                 <w:lang w:val="en-US"/>
-                <w14:ligatures w14:val="none"/>
               </w:rPr>
               <w:drawing>
-                <wp:inline distT="0" distB="0" distL="0" distR="0">
+                <wp:inline distT="0" distB="0" distL="0" distR="0" wp14:anchorId="26C67AAE" wp14:editId="275D3563">
                   <wp:extent cx="1814833" cy="1286510"/>
                   <wp:effectExtent l="0" t="0" r="1270" b="0"/>
                   <wp:docPr id="1680347720" name="Picture 1" descr="A logo for a company&#10;&#10;AI-generated content may be incorrect."/>
@@ -713,7 +712,28 @@
         <w:t>.</w:t>
       </w:r>
     </w:p>
-    <w:p/>
+    <w:p>
+      <w:pPr>
+        <w:sectPr>
+          <w:headerReference w:type="even" r:id="rId9"/>
+          <w:headerReference w:type="default" r:id="rId10"/>
+          <w:footerReference w:type="even" r:id="rId11"/>
+          <w:footerReference w:type="default" r:id="rId12"/>
+          <w:headerReference w:type="first" r:id="rId13"/>
+          <w:footerReference w:type="first" r:id="rId14"/>
+          <w:pgSz w:w="11906" w:h="16838"/>
+          <w:pgMar w:top="741" w:right="1133" w:bottom="570" w:left="1440" w:header="708" w:footer="708" w:gutter="0"/>
+          <w:pgBorders w:offsetFrom="page">
+            <w:top w:val="single" w:sz="4" w:space="24" w:color="auto"/>
+            <w:left w:val="single" w:sz="4" w:space="24" w:color="auto"/>
+            <w:bottom w:val="single" w:sz="4" w:space="24" w:color="auto"/>
+            <w:right w:val="single" w:sz="4" w:space="24" w:color="auto"/>
+          </w:pgBorders>
+          <w:cols w:space="708"/>
+          <w:docGrid w:linePitch="360"/>
+        </w:sectPr>
+      </w:pPr>
+    </w:p>
     <w:p>
       <w:r>
         <w:rPr>
@@ -735,7 +755,7 @@
                     <pic:cNvPicPr/>
                   </pic:nvPicPr>
                   <pic:blipFill>
-                    <a:blip r:embed="rId9"/>
+                    <a:blip r:embed="rId15"/>
                     <a:stretch>
                       <a:fillRect/>
                     </a:stretch>
@@ -759,6 +779,149 @@
     <w:p>
       <w:pPr>
         <w:pStyle w:val="NoSpacing"/>
+        <w:jc w:val="right"/>
+        <w:rPr>
+          <w:b/>
+          <w:bCs/>
+        </w:rPr>
+      </w:pPr>
+    </w:p>
+    <w:p>
+      <w:pPr>
+        <w:pStyle w:val="NoSpacing"/>
+        <w:jc w:val="right"/>
+        <w:rPr>
+          <w:b/>
+          <w:bCs/>
+        </w:rPr>
+      </w:pPr>
+    </w:p>
+    <w:p>
+      <w:pPr>
+        <w:pStyle w:val="NoSpacing"/>
+        <w:jc w:val="right"/>
+        <w:rPr>
+          <w:b/>
+          <w:bCs/>
+        </w:rPr>
+      </w:pPr>
+    </w:p>
+    <w:p>
+      <w:pPr>
+        <w:pStyle w:val="NoSpacing"/>
+        <w:jc w:val="right"/>
+        <w:rPr>
+          <w:b/>
+          <w:bCs/>
+        </w:rPr>
+      </w:pPr>
+    </w:p>
+    <w:p>
+      <w:pPr>
+        <w:pStyle w:val="NoSpacing"/>
+        <w:jc w:val="right"/>
+        <w:rPr>
+          <w:b/>
+          <w:bCs/>
+        </w:rPr>
+      </w:pPr>
+    </w:p>
+    <w:p>
+      <w:pPr>
+        <w:pStyle w:val="NoSpacing"/>
+        <w:jc w:val="right"/>
+        <w:rPr>
+          <w:b/>
+          <w:bCs/>
+        </w:rPr>
+      </w:pPr>
+    </w:p>
+    <w:p>
+      <w:pPr>
+        <w:pStyle w:val="NoSpacing"/>
+        <w:jc w:val="right"/>
+        <w:rPr>
+          <w:b/>
+          <w:bCs/>
+        </w:rPr>
+      </w:pPr>
+      <w:r>
+        <w:rPr>
+          <w:b/>
+          <w:bCs/>
+        </w:rPr>
+        <w:t>[</w:t>
+      </w:r>
+      <w:r>
+        <w:rPr>
+          <w:b/>
+          <w:bCs/>
+        </w:rPr>
+        <w:t>%</w:t>
+      </w:r>
+      <w:proofErr w:type="spellStart"/>
+      <w:r>
+        <w:rPr>
+          <w:b/>
+          <w:bCs/>
+        </w:rPr>
+        <w:t>qrImage</w:t>
+      </w:r>
+      <w:proofErr w:type="spellEnd"/>
+      <w:r>
+        <w:rPr>
+          <w:b/>
+          <w:bCs/>
+        </w:rPr>
+        <w:t>]</w:t>
+      </w:r>
+    </w:p>
+    <w:p>
+      <w:pPr>
+        <w:pStyle w:val="NoSpacing"/>
+        <w:rPr>
+          <w:b/>
+          <w:bCs/>
+        </w:rPr>
+        <w:sectPr>
+          <w:type w:val="continuous"/>
+          <w:pgSz w:w="11906" w:h="16838"/>
+          <w:pgMar w:top="743" w:right="992" w:bottom="442" w:left="1440" w:header="709" w:footer="709" w:gutter="0"/>
+          <w:pgBorders w:offsetFrom="page">
+            <w:top w:val="single" w:sz="4" w:space="24" w:color="auto"/>
+            <w:left w:val="single" w:sz="4" w:space="24" w:color="auto"/>
+            <w:bottom w:val="single" w:sz="4" w:space="24" w:color="auto"/>
+            <w:right w:val="single" w:sz="4" w:space="24" w:color="auto"/>
+          </w:pgBorders>
+          <w:cols w:num="2" w:space="708"/>
+        </w:sectPr>
+      </w:pPr>
+    </w:p>
+    <w:p>
+      <w:pPr>
+        <w:pStyle w:val="NoSpacing"/>
+        <w:rPr>
+          <w:b/>
+          <w:bCs/>
+        </w:rPr>
+        <w:sectPr>
+          <w:type w:val="continuous"/>
+          <w:pgSz w:w="11906" w:h="16838"/>
+          <w:pgMar w:top="741" w:right="1133" w:bottom="570" w:left="1440" w:header="708" w:footer="708" w:gutter="0"/>
+          <w:pgBorders w:offsetFrom="page">
+            <w:top w:val="single" w:sz="4" w:space="24" w:color="auto"/>
+            <w:left w:val="single" w:sz="4" w:space="24" w:color="auto"/>
+            <w:bottom w:val="single" w:sz="4" w:space="24" w:color="auto"/>
+            <w:right w:val="single" w:sz="4" w:space="24" w:color="auto"/>
+          </w:pgBorders>
+          <w:cols w:num="2" w:space="708"/>
+          <w:docGrid w:linePitch="360"/>
+        </w:sectPr>
+      </w:pPr>
+    </w:p>
+    <w:p>
+      <w:pPr>
+        <w:pStyle w:val="NoSpacing"/>
         <w:rPr>
           <w:b/>
           <w:bCs/>
@@ -824,12 +987,21 @@
           <w:bCs/>
         </w:rPr>
       </w:pPr>
-      <w:r>
-        <w:rPr>
-          <w:b/>
-          <w:bCs/>
-        </w:rPr>
-        <w:t>Edulyt India</w:t>
+      <w:proofErr w:type="spellStart"/>
+      <w:r>
+        <w:rPr>
+          <w:b/>
+          <w:bCs/>
+        </w:rPr>
+        <w:t>Airkrit</w:t>
+      </w:r>
+      <w:proofErr w:type="spellEnd"/>
+      <w:r>
+        <w:rPr>
+          <w:b/>
+          <w:bCs/>
+        </w:rPr>
+        <w:t xml:space="preserve"> India</w:t>
       </w:r>
     </w:p>
     <w:p>
@@ -877,7 +1049,7 @@
       <w:r>
         <w:t xml:space="preserve">Note : Future verification can be done on </w:t>
       </w:r>
-      <w:hyperlink r:id="rId10" w:history="1">
+      <w:hyperlink r:id="rId16" w:history="1">
         <w:r>
           <w:rPr>
             <w:rStyle w:val="Hyperlink"/>
@@ -895,12 +1067,7 @@
       </w:pPr>
     </w:p>
     <w:sectPr>
-      <w:headerReference w:type="even" r:id="rId11"/>
-      <w:headerReference w:type="default" r:id="rId12"/>
-      <w:footerReference w:type="even" r:id="rId13"/>
-      <w:footerReference w:type="default" r:id="rId14"/>
-      <w:headerReference w:type="first" r:id="rId15"/>
-      <w:footerReference w:type="first" r:id="rId16"/>
+      <w:type w:val="continuous"/>
       <w:pgSz w:w="11906" w:h="16838"/>
       <w:pgMar w:top="741" w:right="1133" w:bottom="570" w:left="1440" w:header="708" w:footer="708" w:gutter="0"/>
       <w:pgBorders w:offsetFrom="page">
@@ -1519,7 +1686,6 @@
   <w:style w:type="character" w:default="1" w:styleId="DefaultParagraphFont">
     <w:name w:val="Default Paragraph Font"/>
     <w:uiPriority w:val="1"/>
-    <w:semiHidden/>
     <w:unhideWhenUsed/>
   </w:style>
   <w:style w:type="table" w:default="1" w:styleId="TableNormal">

</xml_diff>